<commit_message>
Escrivim directament a l Olga, i el Word dels UDFs anava endarrerit
La carta a l Adria preguntava si escrivim nosaltres a l Olga o ho porta ell, i
correu_olga_families.md ja donava per fet que si -la seva propia nota interna
avisava del xoc. Es resol cap al costat que estalvia una volta: s envia el de
l Olga i a l Adria se li diu. A canvi se li demana una cosa que ell si que sap:
si al final s ha de triar entre A i B, quina fa menys mal a l aplicacio.

Els dos correus s han d enviar el mateix dia i el de l Olga primer.

I el --check ha destapat que comunicacio_udfs_sap.docx era del 26/08 amb el .md
tocat el 10/09: el Word encara anunciava els tres camps, inclos el
U_FCNewCardCode que s ha decidit esborrar. Regenerat.

Els tres .docx tocats avui ja porten segell. Els que queden sense son anteriors
a la comprovacio i ja enviats.

Co-Authored-By: Claude Opus 5 (1M context) <noreply@anthropic.com>
</commit_message>
<xml_diff>
--- a/comunicacio_udfs_sap.docx
+++ b/comunicacio_udfs_sap.docx
@@ -9,6 +9,7 @@
       <w:r>
         <w:rPr>
           <w:b w:val="0"/>
+          <w:i w:val="0"/>
         </w:rPr>
         <w:t>Nous camps d'usuari a SAP Business One — comunicació</w:t>
       </w:r>
@@ -17,54 +18,63 @@
       <w:r>
         <w:rPr>
           <w:b/>
+          <w:i w:val="0"/>
         </w:rPr>
         <w:t>Projecte:</w:t>
       </w:r>
       <w:r>
         <w:rPr>
           <w:b w:val="0"/>
+          <w:i w:val="0"/>
         </w:rPr>
         <w:t xml:space="preserve"> GAPI07 — Integració SAP B1 → Analitza CM </w:t>
       </w:r>
       <w:r>
         <w:rPr>
           <w:b/>
+          <w:i w:val="0"/>
         </w:rPr>
         <w:t>De:</w:t>
       </w:r>
       <w:r>
         <w:rPr>
           <w:b w:val="0"/>
+          <w:i w:val="0"/>
         </w:rPr>
         <w:t xml:space="preserve"> Oscar Hijazo (Agrienergia) — ohijazo@agrienergia.com </w:t>
       </w:r>
       <w:r>
         <w:rPr>
           <w:b/>
+          <w:i w:val="0"/>
         </w:rPr>
         <w:t>Data:</w:t>
       </w:r>
       <w:r>
         <w:rPr>
           <w:b w:val="0"/>
+          <w:i w:val="0"/>
         </w:rPr>
         <w:t xml:space="preserve"> 26 d'agost de 2026 </w:t>
       </w:r>
       <w:r>
         <w:rPr>
           <w:b/>
+          <w:i w:val="0"/>
         </w:rPr>
         <w:t>Quan:</w:t>
       </w:r>
       <w:r>
         <w:rPr>
           <w:b w:val="0"/>
+          <w:i w:val="0"/>
         </w:rPr>
         <w:t xml:space="preserve"> creats i poblats abans de l'</w:t>
       </w:r>
       <w:r>
         <w:rPr>
           <w:b/>
+          <w:i w:val="0"/>
         </w:rPr>
         <w:t>1 de novembre de 2026</w:t>
       </w:r>
@@ -73,18 +83,21 @@
       <w:r>
         <w:rPr>
           <w:b w:val="0"/>
+          <w:i w:val="0"/>
         </w:rPr>
         <w:t xml:space="preserve">Us informo que crearé tres camps d'usuari a SAP. </w:t>
       </w:r>
       <w:r>
         <w:rPr>
           <w:b/>
+          <w:i w:val="0"/>
         </w:rPr>
         <w:t>Els creo i els omplo jo</w:t>
       </w:r>
       <w:r>
         <w:rPr>
           <w:b w:val="0"/>
+          <w:i w:val="0"/>
         </w:rPr>
         <w:t>; no us demano feina. Us ho comunico perquè afecta l'esquema d'un sistema que doneu suport, i perquè al final hi ha una pregunta on el vostre criteri em pot estalviar temps.</w:t>
       </w:r>
@@ -96,6 +109,7 @@
       <w:r>
         <w:rPr>
           <w:b w:val="0"/>
+          <w:i w:val="0"/>
         </w:rPr>
         <w:t>Els camps</w:t>
       </w:r>
@@ -122,6 +136,7 @@
             <w:r>
               <w:rPr>
                 <w:b/>
+                <w:i w:val="0"/>
               </w:rPr>
               <w:t>Taula</w:t>
             </w:r>
@@ -135,6 +150,7 @@
             <w:r>
               <w:rPr>
                 <w:b/>
+                <w:i w:val="0"/>
               </w:rPr>
               <w:t>Nom del camp</w:t>
             </w:r>
@@ -148,6 +164,7 @@
             <w:r>
               <w:rPr>
                 <w:b/>
+                <w:i w:val="0"/>
               </w:rPr>
               <w:t>Tipus</w:t>
             </w:r>
@@ -161,6 +178,7 @@
             <w:r>
               <w:rPr>
                 <w:b/>
+                <w:i w:val="0"/>
               </w:rPr>
               <w:t>Mida</w:t>
             </w:r>
@@ -174,6 +192,7 @@
             <w:r>
               <w:rPr>
                 <w:b/>
+                <w:i w:val="0"/>
               </w:rPr>
               <w:t>Estat</w:t>
             </w:r>
@@ -190,6 +209,7 @@
               <w:rPr>
                 <w:rFonts w:ascii="Consolas" w:hAnsi="Consolas"/>
                 <w:b w:val="0"/>
+                <w:i w:val="0"/>
                 <w:color w:val="333333"/>
                 <w:sz w:val="20"/>
               </w:rPr>
@@ -198,6 +218,7 @@
             <w:r>
               <w:rPr>
                 <w:b w:val="0"/>
+                <w:i w:val="0"/>
               </w:rPr>
               <w:t xml:space="preserve"> — Empleats de vendes</w:t>
             </w:r>
@@ -212,6 +233,7 @@
               <w:rPr>
                 <w:rFonts w:ascii="Consolas" w:hAnsi="Consolas"/>
                 <w:b w:val="0"/>
+                <w:i w:val="0"/>
                 <w:color w:val="333333"/>
                 <w:sz w:val="20"/>
               </w:rPr>
@@ -227,6 +249,7 @@
             <w:r>
               <w:rPr>
                 <w:b w:val="0"/>
+                <w:i w:val="0"/>
               </w:rPr>
               <w:t>Alfanumèric</w:t>
             </w:r>
@@ -240,6 +263,7 @@
             <w:r>
               <w:rPr>
                 <w:b w:val="0"/>
+                <w:i w:val="0"/>
               </w:rPr>
               <w:t>—</w:t>
             </w:r>
@@ -253,12 +277,14 @@
             <w:r>
               <w:rPr>
                 <w:b/>
+                <w:i w:val="0"/>
               </w:rPr>
               <w:t>Ja existeix i està poblat.</w:t>
             </w:r>
             <w:r>
               <w:rPr>
                 <w:b w:val="0"/>
+                <w:i w:val="0"/>
               </w:rPr>
               <w:t xml:space="preserve"> No el toco</w:t>
             </w:r>
@@ -275,6 +301,7 @@
               <w:rPr>
                 <w:rFonts w:ascii="Consolas" w:hAnsi="Consolas"/>
                 <w:b w:val="0"/>
+                <w:i w:val="0"/>
                 <w:color w:val="333333"/>
                 <w:sz w:val="20"/>
               </w:rPr>
@@ -283,6 +310,7 @@
             <w:r>
               <w:rPr>
                 <w:b w:val="0"/>
+                <w:i w:val="0"/>
               </w:rPr>
               <w:t xml:space="preserve"> — Interlocutors comercials</w:t>
             </w:r>
@@ -297,6 +325,7 @@
               <w:rPr>
                 <w:rFonts w:ascii="Consolas" w:hAnsi="Consolas"/>
                 <w:b w:val="0"/>
+                <w:i w:val="0"/>
                 <w:color w:val="333333"/>
                 <w:sz w:val="20"/>
               </w:rPr>
@@ -312,6 +341,7 @@
             <w:r>
               <w:rPr>
                 <w:b w:val="0"/>
+                <w:i w:val="0"/>
               </w:rPr>
               <w:t>Alfanumèric</w:t>
             </w:r>
@@ -325,6 +355,7 @@
             <w:r>
               <w:rPr>
                 <w:b w:val="0"/>
+                <w:i w:val="0"/>
               </w:rPr>
               <w:t>20</w:t>
             </w:r>
@@ -338,6 +369,7 @@
             <w:r>
               <w:rPr>
                 <w:b w:val="0"/>
+                <w:i w:val="0"/>
               </w:rPr>
               <w:t>El crearé</w:t>
             </w:r>
@@ -354,6 +386,7 @@
               <w:rPr>
                 <w:rFonts w:ascii="Consolas" w:hAnsi="Consolas"/>
                 <w:b w:val="0"/>
+                <w:i w:val="0"/>
                 <w:color w:val="333333"/>
                 <w:sz w:val="20"/>
               </w:rPr>
@@ -362,6 +395,7 @@
             <w:r>
               <w:rPr>
                 <w:b w:val="0"/>
+                <w:i w:val="0"/>
               </w:rPr>
               <w:t xml:space="preserve"> — Interlocutors comercials</w:t>
             </w:r>
@@ -376,6 +410,7 @@
               <w:rPr>
                 <w:rFonts w:ascii="Consolas" w:hAnsi="Consolas"/>
                 <w:b w:val="0"/>
+                <w:i w:val="0"/>
                 <w:color w:val="333333"/>
                 <w:sz w:val="20"/>
               </w:rPr>
@@ -391,6 +426,7 @@
             <w:r>
               <w:rPr>
                 <w:b w:val="0"/>
+                <w:i w:val="0"/>
               </w:rPr>
               <w:t>Alfanumèric</w:t>
             </w:r>
@@ -404,6 +440,7 @@
             <w:r>
               <w:rPr>
                 <w:b w:val="0"/>
+                <w:i w:val="0"/>
               </w:rPr>
               <w:t>15</w:t>
             </w:r>
@@ -417,6 +454,7 @@
             <w:r>
               <w:rPr>
                 <w:b w:val="0"/>
+                <w:i w:val="0"/>
               </w:rPr>
               <w:t>El crearé</w:t>
             </w:r>
@@ -433,6 +471,7 @@
               <w:rPr>
                 <w:rFonts w:ascii="Consolas" w:hAnsi="Consolas"/>
                 <w:b w:val="0"/>
+                <w:i w:val="0"/>
                 <w:color w:val="333333"/>
                 <w:sz w:val="20"/>
               </w:rPr>
@@ -441,6 +480,7 @@
             <w:r>
               <w:rPr>
                 <w:b w:val="0"/>
+                <w:i w:val="0"/>
               </w:rPr>
               <w:t xml:space="preserve"> — Grups d'articles</w:t>
             </w:r>
@@ -455,6 +495,7 @@
               <w:rPr>
                 <w:rFonts w:ascii="Consolas" w:hAnsi="Consolas"/>
                 <w:b w:val="0"/>
+                <w:i w:val="0"/>
                 <w:color w:val="333333"/>
                 <w:sz w:val="20"/>
               </w:rPr>
@@ -470,6 +511,7 @@
             <w:r>
               <w:rPr>
                 <w:b w:val="0"/>
+                <w:i w:val="0"/>
               </w:rPr>
               <w:t>Alfanumèric</w:t>
             </w:r>
@@ -483,6 +525,7 @@
             <w:r>
               <w:rPr>
                 <w:b w:val="0"/>
+                <w:i w:val="0"/>
               </w:rPr>
               <w:t>20</w:t>
             </w:r>
@@ -496,6 +539,7 @@
             <w:r>
               <w:rPr>
                 <w:b w:val="0"/>
+                <w:i w:val="0"/>
               </w:rPr>
               <w:t>El crearé</w:t>
             </w:r>
@@ -508,6 +552,7 @@
       <w:r>
         <w:rPr>
           <w:b w:val="0"/>
+          <w:i w:val="0"/>
         </w:rPr>
         <w:t xml:space="preserve">A </w:t>
       </w:r>
@@ -515,6 +560,7 @@
         <w:rPr>
           <w:rFonts w:ascii="Consolas" w:hAnsi="Consolas"/>
           <w:b w:val="0"/>
+          <w:i w:val="0"/>
           <w:color w:val="333333"/>
           <w:sz w:val="20"/>
         </w:rPr>
@@ -523,6 +569,7 @@
       <w:r>
         <w:rPr>
           <w:b w:val="0"/>
+          <w:i w:val="0"/>
         </w:rPr>
         <w:t xml:space="preserve"> (Articles) no cal res: els </w:t>
       </w:r>
@@ -530,6 +577,7 @@
         <w:rPr>
           <w:rFonts w:ascii="Consolas" w:hAnsi="Consolas"/>
           <w:b w:val="0"/>
+          <w:i w:val="0"/>
           <w:color w:val="333333"/>
           <w:sz w:val="20"/>
         </w:rPr>
@@ -538,6 +586,7 @@
       <w:r>
         <w:rPr>
           <w:b w:val="0"/>
+          <w:i w:val="0"/>
         </w:rPr>
         <w:t xml:space="preserve"> de SAP ja són els mateixos codis que tenia l'ERP anterior.</w:t>
       </w:r>
@@ -546,6 +595,7 @@
       <w:r>
         <w:rPr>
           <w:b w:val="0"/>
+          <w:i w:val="0"/>
         </w:rPr>
         <w:t>Cap dels tres serà obligatori ni tindrà valor per defecte: han de poder quedar buits sense bloquejar l'alta d'un client ni d'un grup d'articles.</w:t>
       </w:r>
@@ -557,6 +607,7 @@
       <w:r>
         <w:rPr>
           <w:b w:val="0"/>
+          <w:i w:val="0"/>
         </w:rPr>
         <w:t>Per què</w:t>
       </w:r>
@@ -565,30 +616,35 @@
       <w:r>
         <w:rPr>
           <w:b w:val="0"/>
+          <w:i w:val="0"/>
         </w:rPr>
         <w:t xml:space="preserve">Agrienergia alimenta la plataforma d'anàlisi comercial </w:t>
       </w:r>
       <w:r>
         <w:rPr>
           <w:b/>
+          <w:i w:val="0"/>
         </w:rPr>
         <w:t>Analitza CM</w:t>
       </w:r>
       <w:r>
         <w:rPr>
           <w:b w:val="0"/>
+          <w:i w:val="0"/>
         </w:rPr>
         <w:t xml:space="preserve"> amb una base de dades intermèdia. Fins ara s'omplia des de l'ERP antic (KAIS); a partir del </w:t>
       </w:r>
       <w:r>
         <w:rPr>
           <w:b/>
+          <w:i w:val="0"/>
         </w:rPr>
         <w:t>2 de novembre</w:t>
       </w:r>
       <w:r>
         <w:rPr>
           <w:b w:val="0"/>
+          <w:i w:val="0"/>
         </w:rPr>
         <w:t xml:space="preserve"> s'omplirà des de SAP Business One.</w:t>
       </w:r>
@@ -597,18 +653,21 @@
       <w:r>
         <w:rPr>
           <w:b w:val="0"/>
+          <w:i w:val="0"/>
         </w:rPr>
         <w:t xml:space="preserve">El problema és que </w:t>
       </w:r>
       <w:r>
         <w:rPr>
           <w:b/>
+          <w:i w:val="0"/>
         </w:rPr>
         <w:t>els codis interns de SAP no són els mateixos que els de KAIS</w:t>
       </w:r>
       <w:r>
         <w:rPr>
           <w:b w:val="0"/>
+          <w:i w:val="0"/>
         </w:rPr>
         <w:t>. Ho hem verificat consultant SAP per Service Layer:</w:t>
       </w:r>
@@ -620,12 +679,14 @@
       <w:r>
         <w:rPr>
           <w:b/>
+          <w:i w:val="0"/>
         </w:rPr>
         <w:t>Comercials:</w:t>
       </w:r>
       <w:r>
         <w:rPr>
           <w:b w:val="0"/>
+          <w:i w:val="0"/>
         </w:rPr>
         <w:t xml:space="preserve"> de 48 comparats, només 2 coincideixen.</w:t>
       </w:r>
@@ -637,12 +698,14 @@
       <w:r>
         <w:rPr>
           <w:b/>
+          <w:i w:val="0"/>
         </w:rPr>
         <w:t>Grups d'articles:</w:t>
       </w:r>
       <w:r>
         <w:rPr>
           <w:b w:val="0"/>
+          <w:i w:val="0"/>
         </w:rPr>
         <w:t xml:space="preserve"> SAP els numera internament (108, 109, 110…), sense relació amb els antics.</w:t>
       </w:r>
@@ -654,12 +717,14 @@
       <w:r>
         <w:rPr>
           <w:b/>
+          <w:i w:val="0"/>
         </w:rPr>
         <w:t>Clients:</w:t>
       </w:r>
       <w:r>
         <w:rPr>
           <w:b w:val="0"/>
+          <w:i w:val="0"/>
         </w:rPr>
         <w:t xml:space="preserve"> tampoc coincideixen, i no hi ha cap camp que guardi el codi antic de manera fiable (</w:t>
       </w:r>
@@ -667,6 +732,7 @@
         <w:rPr>
           <w:rFonts w:ascii="Consolas" w:hAnsi="Consolas"/>
           <w:b w:val="0"/>
+          <w:i w:val="0"/>
           <w:color w:val="333333"/>
           <w:sz w:val="20"/>
         </w:rPr>
@@ -675,6 +741,7 @@
       <w:r>
         <w:rPr>
           <w:b w:val="0"/>
+          <w:i w:val="0"/>
         </w:rPr>
         <w:t xml:space="preserve"> només està informat en 10 clients de 500 i la numeració no lliga).</w:t>
       </w:r>
@@ -686,24 +753,28 @@
       <w:r>
         <w:rPr>
           <w:b/>
+          <w:i w:val="0"/>
         </w:rPr>
         <w:t>Articles:</w:t>
       </w:r>
       <w:r>
         <w:rPr>
           <w:b w:val="0"/>
+          <w:i w:val="0"/>
         </w:rPr>
         <w:t xml:space="preserve"> aquests </w:t>
       </w:r>
       <w:r>
         <w:rPr>
           <w:b/>
+          <w:i w:val="0"/>
         </w:rPr>
         <w:t>sí</w:t>
       </w:r>
       <w:r>
         <w:rPr>
           <w:b w:val="0"/>
+          <w:i w:val="0"/>
         </w:rPr>
         <w:t xml:space="preserve"> que es van preservar a la migració.</w:t>
       </w:r>
@@ -712,18 +783,21 @@
       <w:r>
         <w:rPr>
           <w:b w:val="0"/>
+          <w:i w:val="0"/>
         </w:rPr>
         <w:t xml:space="preserve">Si el dia del canvi Analitza rep codis diferents dels que té, no ho interpreta com un canvi de sistema: ho interpreta com que </w:t>
       </w:r>
       <w:r>
         <w:rPr>
           <w:b/>
+          <w:i w:val="0"/>
         </w:rPr>
         <w:t>tots els clients històrics han desaparegut i n'han aparegut de nous</w:t>
       </w:r>
       <w:r>
         <w:rPr>
           <w:b w:val="0"/>
+          <w:i w:val="0"/>
         </w:rPr>
         <w:t>. Es perd l'històric comercial, i els comercials i les famílies queden desvinculats de les seves vendes anteriors.</w:t>
       </w:r>
@@ -732,18 +806,21 @@
       <w:r>
         <w:rPr>
           <w:b w:val="0"/>
+          <w:i w:val="0"/>
         </w:rPr>
         <w:t xml:space="preserve">La solució és guardar el codi antic a SAP i enviar aquest a Analitza. Als empleats de vendes </w:t>
       </w:r>
       <w:r>
         <w:rPr>
           <w:b/>
+          <w:i w:val="0"/>
         </w:rPr>
         <w:t>ja existeix</w:t>
       </w:r>
       <w:r>
         <w:rPr>
           <w:b w:val="0"/>
+          <w:i w:val="0"/>
         </w:rPr>
         <w:t xml:space="preserve"> (</w:t>
       </w:r>
@@ -751,6 +828,7 @@
         <w:rPr>
           <w:rFonts w:ascii="Consolas" w:hAnsi="Consolas"/>
           <w:b w:val="0"/>
+          <w:i w:val="0"/>
           <w:color w:val="333333"/>
           <w:sz w:val="20"/>
         </w:rPr>
@@ -759,6 +837,7 @@
       <w:r>
         <w:rPr>
           <w:b w:val="0"/>
+          <w:i w:val="0"/>
         </w:rPr>
         <w:t>, informat en 48 dels 49): es tracta d'estendre a clients i grups d'articles el mateix criteri que ja es va aplicar allà.</w:t>
       </w:r>
@@ -770,6 +849,7 @@
       <w:r>
         <w:rPr>
           <w:b w:val="0"/>
+          <w:i w:val="0"/>
         </w:rPr>
         <w:t>Contingut i manteniment</w:t>
       </w:r>
@@ -779,6 +859,7 @@
         <w:rPr>
           <w:rFonts w:ascii="Consolas" w:hAnsi="Consolas"/>
           <w:b/>
+          <w:i w:val="0"/>
           <w:color w:val="333333"/>
           <w:sz w:val="20"/>
         </w:rPr>
@@ -787,6 +868,7 @@
       <w:r>
         <w:rPr>
           <w:b w:val="0"/>
+          <w:i w:val="0"/>
         </w:rPr>
         <w:t xml:space="preserve"> — el codi que tenia el client a KAIS (8 dígits, p. ex. </w:t>
       </w:r>
@@ -794,6 +876,7 @@
         <w:rPr>
           <w:rFonts w:ascii="Consolas" w:hAnsi="Consolas"/>
           <w:b w:val="0"/>
+          <w:i w:val="0"/>
           <w:color w:val="333333"/>
           <w:sz w:val="20"/>
         </w:rPr>
@@ -802,6 +885,7 @@
       <w:r>
         <w:rPr>
           <w:b w:val="0"/>
+          <w:i w:val="0"/>
         </w:rPr>
         <w:t>). L'omplo un sol cop abans de l'1 de novembre, a partir de la correspondència que ens facilita Analitza creuada pel CIF. Un cop poblat no es torna a tocar. Els clients donats d'alta després del canvi el deixen buit: no han existit mai a KAIS i han d'aparèixer com a nous.</w:t>
       </w:r>
@@ -811,6 +895,7 @@
         <w:rPr>
           <w:rFonts w:ascii="Consolas" w:hAnsi="Consolas"/>
           <w:b/>
+          <w:i w:val="0"/>
           <w:color w:val="333333"/>
           <w:sz w:val="20"/>
         </w:rPr>
@@ -819,6 +904,7 @@
       <w:r>
         <w:rPr>
           <w:b w:val="0"/>
+          <w:i w:val="0"/>
         </w:rPr>
         <w:t xml:space="preserve"> — el </w:t>
       </w:r>
@@ -826,6 +912,7 @@
         <w:rPr>
           <w:rFonts w:ascii="Consolas" w:hAnsi="Consolas"/>
           <w:b w:val="0"/>
+          <w:i w:val="0"/>
           <w:color w:val="333333"/>
           <w:sz w:val="20"/>
         </w:rPr>
@@ -834,6 +921,7 @@
       <w:r>
         <w:rPr>
           <w:b w:val="0"/>
+          <w:i w:val="0"/>
         </w:rPr>
         <w:t xml:space="preserve"> del client successor, quan es desactiva un client i se n'obre un altre per canvi de raó social. L'omplo cada vegada que passa. Per defecte, buit. Reprodueix una funcionalitat que l'ERP anterior ja tenia i que Analitza consumeix per no comptabilitzar un canvi de raó social com un client perdut més un de guanyat.</w:t>
       </w:r>
@@ -843,6 +931,7 @@
         <w:rPr>
           <w:rFonts w:ascii="Consolas" w:hAnsi="Consolas"/>
           <w:b/>
+          <w:i w:val="0"/>
           <w:color w:val="333333"/>
           <w:sz w:val="20"/>
         </w:rPr>
@@ -851,6 +940,7 @@
       <w:r>
         <w:rPr>
           <w:b w:val="0"/>
+          <w:i w:val="0"/>
         </w:rPr>
         <w:t xml:space="preserve"> — el codi antic del grup (6 dígits, p. ex. </w:t>
       </w:r>
@@ -858,6 +948,7 @@
         <w:rPr>
           <w:rFonts w:ascii="Consolas" w:hAnsi="Consolas"/>
           <w:b w:val="0"/>
+          <w:i w:val="0"/>
           <w:color w:val="333333"/>
           <w:sz w:val="20"/>
         </w:rPr>
@@ -866,6 +957,7 @@
       <w:r>
         <w:rPr>
           <w:b w:val="0"/>
+          <w:i w:val="0"/>
         </w:rPr>
         <w:t xml:space="preserve">). L'omplo un sol cop; el codi es pot deduir del nom del grup, que ara té el format </w:t>
       </w:r>
@@ -873,6 +965,7 @@
         <w:rPr>
           <w:rFonts w:ascii="Consolas" w:hAnsi="Consolas"/>
           <w:b w:val="0"/>
+          <w:i w:val="0"/>
           <w:color w:val="333333"/>
           <w:sz w:val="20"/>
         </w:rPr>
@@ -881,6 +974,7 @@
       <w:r>
         <w:rPr>
           <w:b w:val="0"/>
+          <w:i w:val="0"/>
         </w:rPr>
         <w:t>.</w:t>
       </w:r>
@@ -892,6 +986,7 @@
       <w:r>
         <w:rPr>
           <w:b w:val="0"/>
+          <w:i w:val="0"/>
         </w:rPr>
         <w:t>Dues coses on em podeu ajudar</w:t>
       </w:r>
@@ -900,6 +995,7 @@
       <w:r>
         <w:rPr>
           <w:b/>
+          <w:i w:val="0"/>
         </w:rPr>
         <w:t xml:space="preserve">1. ¿Es poden crear camps d'usuari sobre </w:t>
       </w:r>
@@ -907,6 +1003,7 @@
         <w:rPr>
           <w:rFonts w:ascii="Consolas" w:hAnsi="Consolas"/>
           <w:b/>
+          <w:i w:val="0"/>
           <w:color w:val="333333"/>
           <w:sz w:val="20"/>
         </w:rPr>
@@ -915,12 +1012,14 @@
       <w:r>
         <w:rPr>
           <w:b/>
+          <w:i w:val="0"/>
         </w:rPr>
         <w:t xml:space="preserve"> en aquesta instal·lació?</w:t>
       </w:r>
       <w:r>
         <w:rPr>
           <w:b w:val="0"/>
+          <w:i w:val="0"/>
         </w:rPr>
         <w:t xml:space="preserve"> No em consta que n'hi hagi cap i no ho vull donar per fet. Si no és possible, digueu-m'ho: tinc una alternativa —llegir el codi del propi nom del grup— menys robusta però viable.</w:t>
       </w:r>
@@ -929,12 +1028,14 @@
       <w:r>
         <w:rPr>
           <w:b/>
+          <w:i w:val="0"/>
         </w:rPr>
         <w:t>2. ¿Quina finestra em recomaneu per crear-los?</w:t>
       </w:r>
       <w:r>
         <w:rPr>
           <w:b w:val="0"/>
+          <w:i w:val="0"/>
         </w:rPr>
         <w:t xml:space="preserve"> Entenc que afegir camps pot requerir que no hi hagi ningú connectat. Digueu-me com ho feu habitualment i ho planifico fora d'hores.</w:t>
       </w:r>
@@ -946,6 +1047,7 @@
       <w:r>
         <w:rPr>
           <w:b w:val="0"/>
+          <w:i w:val="0"/>
         </w:rPr>
         <w:t>Consideracions</w:t>
       </w:r>
@@ -954,12 +1056,14 @@
       <w:r>
         <w:rPr>
           <w:b/>
+          <w:i w:val="0"/>
         </w:rPr>
         <w:t>Convenció de noms.</w:t>
       </w:r>
       <w:r>
         <w:rPr>
           <w:b w:val="0"/>
+          <w:i w:val="0"/>
         </w:rPr>
         <w:t xml:space="preserve"> Faig servir el prefix </w:t>
       </w:r>
@@ -967,6 +1071,7 @@
         <w:rPr>
           <w:rFonts w:ascii="Consolas" w:hAnsi="Consolas"/>
           <w:b w:val="0"/>
+          <w:i w:val="0"/>
           <w:color w:val="333333"/>
           <w:sz w:val="20"/>
         </w:rPr>
@@ -975,6 +1080,7 @@
       <w:r>
         <w:rPr>
           <w:b w:val="0"/>
+          <w:i w:val="0"/>
         </w:rPr>
         <w:t>, que és el que ja porten els camps propis d'Agrienergia (</w:t>
       </w:r>
@@ -982,6 +1088,7 @@
         <w:rPr>
           <w:rFonts w:ascii="Consolas" w:hAnsi="Consolas"/>
           <w:b w:val="0"/>
+          <w:i w:val="0"/>
           <w:color w:val="333333"/>
           <w:sz w:val="20"/>
         </w:rPr>
@@ -990,6 +1097,7 @@
       <w:r>
         <w:rPr>
           <w:b w:val="0"/>
+          <w:i w:val="0"/>
         </w:rPr>
         <w:t xml:space="preserve">, </w:t>
       </w:r>
@@ -997,6 +1105,7 @@
         <w:rPr>
           <w:rFonts w:ascii="Consolas" w:hAnsi="Consolas"/>
           <w:b w:val="0"/>
+          <w:i w:val="0"/>
           <w:color w:val="333333"/>
           <w:sz w:val="20"/>
         </w:rPr>
@@ -1005,6 +1114,7 @@
       <w:r>
         <w:rPr>
           <w:b w:val="0"/>
+          <w:i w:val="0"/>
         </w:rPr>
         <w:t xml:space="preserve">, </w:t>
       </w:r>
@@ -1012,6 +1122,7 @@
         <w:rPr>
           <w:rFonts w:ascii="Consolas" w:hAnsi="Consolas"/>
           <w:b w:val="0"/>
+          <w:i w:val="0"/>
           <w:color w:val="333333"/>
           <w:sz w:val="20"/>
         </w:rPr>
@@ -1020,6 +1131,7 @@
       <w:r>
         <w:rPr>
           <w:b w:val="0"/>
+          <w:i w:val="0"/>
         </w:rPr>
         <w:t xml:space="preserve">…), per distingir-los dels </w:t>
       </w:r>
@@ -1027,6 +1139,7 @@
         <w:rPr>
           <w:rFonts w:ascii="Consolas" w:hAnsi="Consolas"/>
           <w:b w:val="0"/>
+          <w:i w:val="0"/>
           <w:color w:val="333333"/>
           <w:sz w:val="20"/>
         </w:rPr>
@@ -1035,6 +1148,7 @@
       <w:r>
         <w:rPr>
           <w:b w:val="0"/>
+          <w:i w:val="0"/>
         </w:rPr>
         <w:t xml:space="preserve"> de la implantació.</w:t>
       </w:r>
@@ -1043,24 +1157,28 @@
       <w:r>
         <w:rPr>
           <w:b/>
+          <w:i w:val="0"/>
         </w:rPr>
         <w:t>Res escriu a SAP de manera automàtica.</w:t>
       </w:r>
       <w:r>
         <w:rPr>
           <w:b w:val="0"/>
+          <w:i w:val="0"/>
         </w:rPr>
         <w:t xml:space="preserve"> El procés que alimenta Analitza llegeix SAP per Service Layer amb un usuari de només lectura i </w:t>
       </w:r>
       <w:r>
         <w:rPr>
           <w:b/>
+          <w:i w:val="0"/>
         </w:rPr>
         <w:t>no hi escriu mai</w:t>
       </w:r>
       <w:r>
         <w:rPr>
           <w:b w:val="0"/>
+          <w:i w:val="0"/>
         </w:rPr>
         <w:t>. La població d'aquests camps la faig jo, per la via que em digueu que és la correcta.</w:t>
       </w:r>
@@ -1069,12 +1187,14 @@
       <w:r>
         <w:rPr>
           <w:b/>
+          <w:i w:val="0"/>
         </w:rPr>
         <w:t>La població ha de ser completa.</w:t>
       </w:r>
       <w:r>
         <w:rPr>
           <w:b w:val="0"/>
+          <w:i w:val="0"/>
         </w:rPr>
         <w:t xml:space="preserve"> Si un client que ja existia es queda amb el camp buit, el procés no el pot distingir d'un client nou i Analitza el comptabilitzarà com a tal. No hi ha manera automàtica de detectar-ho a posteriori: per això la data és l'1 de novembre i no el mateix dia del canvi.</w:t>
       </w:r>
@@ -1086,6 +1206,7 @@
       <w:r>
         <w:rPr>
           <w:b w:val="0"/>
+          <w:i w:val="0"/>
         </w:rPr>
         <w:t>Dates</w:t>
       </w:r>
@@ -1109,6 +1230,7 @@
             <w:r>
               <w:rPr>
                 <w:b/>
+                <w:i w:val="0"/>
               </w:rPr>
               <w:t>Quan</w:t>
             </w:r>
@@ -1122,6 +1244,7 @@
             <w:r>
               <w:rPr>
                 <w:b/>
+                <w:i w:val="0"/>
               </w:rPr>
               <w:t>Què</w:t>
             </w:r>
@@ -1137,6 +1260,7 @@
             <w:r>
               <w:rPr>
                 <w:b w:val="0"/>
+                <w:i w:val="0"/>
               </w:rPr>
               <w:t>Setembre</w:t>
             </w:r>
@@ -1150,6 +1274,7 @@
             <w:r>
               <w:rPr>
                 <w:b w:val="0"/>
+                <w:i w:val="0"/>
               </w:rPr>
               <w:t>Creació dels tres camps, en la finestra que em digueu</w:t>
             </w:r>
@@ -1165,6 +1290,7 @@
             <w:r>
               <w:rPr>
                 <w:b w:val="0"/>
+                <w:i w:val="0"/>
               </w:rPr>
               <w:t>Octubre</w:t>
             </w:r>
@@ -1178,6 +1304,7 @@
             <w:r>
               <w:rPr>
                 <w:b w:val="0"/>
+                <w:i w:val="0"/>
               </w:rPr>
               <w:t xml:space="preserve">Població de </w:t>
             </w:r>
@@ -1185,6 +1312,7 @@
               <w:rPr>
                 <w:rFonts w:ascii="Consolas" w:hAnsi="Consolas"/>
                 <w:b w:val="0"/>
+                <w:i w:val="0"/>
                 <w:color w:val="333333"/>
                 <w:sz w:val="20"/>
               </w:rPr>
@@ -1193,6 +1321,7 @@
             <w:r>
               <w:rPr>
                 <w:b w:val="0"/>
+                <w:i w:val="0"/>
               </w:rPr>
               <w:t xml:space="preserve"> a clients i grups d'articles</w:t>
             </w:r>
@@ -1208,6 +1337,7 @@
             <w:r>
               <w:rPr>
                 <w:b/>
+                <w:i w:val="0"/>
               </w:rPr>
               <w:t>1 de novembre</w:t>
             </w:r>
@@ -1221,6 +1351,7 @@
             <w:r>
               <w:rPr>
                 <w:b w:val="0"/>
+                <w:i w:val="0"/>
               </w:rPr>
               <w:t>Tot creat i poblat, verificat</w:t>
             </w:r>
@@ -1236,6 +1367,7 @@
             <w:r>
               <w:rPr>
                 <w:b/>
+                <w:i w:val="0"/>
               </w:rPr>
               <w:t>2 de novembre</w:t>
             </w:r>
@@ -1249,6 +1381,7 @@
             <w:r>
               <w:rPr>
                 <w:b w:val="0"/>
+                <w:i w:val="0"/>
               </w:rPr>
               <w:t>Es comença a treballar amb SAP; Analitza passa a llegir del nou origen</w:t>
             </w:r>
@@ -1261,6 +1394,7 @@
       <w:r>
         <w:rPr>
           <w:b w:val="0"/>
+          <w:i w:val="0"/>
         </w:rPr>
         <w:t>Si veieu algun inconvenient o una manera millor de resoldre-ho, digueu-m'ho abans de setembre i ho parlem.</w:t>
       </w:r>
@@ -1272,6 +1406,7 @@
       <w:r>
         <w:rPr>
           <w:b w:val="0"/>
+          <w:i w:val="0"/>
         </w:rPr>
         <w:t>Atentament,</w:t>
       </w:r>
@@ -1283,6 +1418,7 @@
       <w:r>
         <w:rPr>
           <w:b w:val="0"/>
+          <w:i w:val="0"/>
         </w:rPr>
         <w:t>Oscar Hijazo</w:t>
       </w:r>
@@ -1294,6 +1430,7 @@
       <w:r>
         <w:rPr>
           <w:b w:val="0"/>
+          <w:i w:val="0"/>
         </w:rPr>
         <w:t>Agrienergia</w:t>
       </w:r>
@@ -1305,8 +1442,437 @@
       <w:r>
         <w:rPr>
           <w:b w:val="0"/>
+          <w:i w:val="0"/>
         </w:rPr>
         <w:t>ohijazo@agrienergia.com</w:t>
+      </w:r>
+    </w:p>
+    <w:p>
+      <w:pPr>
+        <w:pStyle w:val="Heading2"/>
+      </w:pPr>
+      <w:r>
+        <w:rPr>
+          <w:b w:val="0"/>
+          <w:i w:val="0"/>
+        </w:rPr>
+        <w:t>Correcció posterior — 10 de setembre de 2026</w:t>
+      </w:r>
+    </w:p>
+    <w:p>
+      <w:r>
+        <w:rPr>
+          <w:rFonts w:ascii="Consolas" w:hAnsi="Consolas"/>
+          <w:b/>
+          <w:i w:val="0"/>
+          <w:color w:val="333333"/>
+          <w:sz w:val="20"/>
+        </w:rPr>
+        <w:t>OCRD.U_FCNewCardCode</w:t>
+      </w:r>
+      <w:r>
+        <w:rPr>
+          <w:b/>
+          <w:i w:val="0"/>
+        </w:rPr>
+        <w:t xml:space="preserve"> es retira. Els camps queden en dos, no en tres.</w:t>
+      </w:r>
+    </w:p>
+    <w:p>
+      <w:r>
+        <w:rPr>
+          <w:b w:val="0"/>
+          <w:i w:val="0"/>
+        </w:rPr>
+        <w:t xml:space="preserve">El camp per al client successor no calia: </w:t>
+      </w:r>
+      <w:r>
+        <w:rPr>
+          <w:rFonts w:ascii="Consolas" w:hAnsi="Consolas"/>
+          <w:b w:val="0"/>
+          <w:i w:val="0"/>
+          <w:color w:val="333333"/>
+          <w:sz w:val="20"/>
+        </w:rPr>
+        <w:t>OCRD.U_SEICodienllac</w:t>
+      </w:r>
+      <w:r>
+        <w:rPr>
+          <w:b w:val="0"/>
+          <w:i w:val="0"/>
+        </w:rPr>
+        <w:t xml:space="preserve">, de la implantació, ja fa aquesta funció i el duplicava. El 25 d'agost el vam mirar buscant-hi el codi de l'ERP antic, vam veure que només l'omplien 10 clients de 500 i el vam descartar. La lectura era equivocada: no guarda el codi antic de cada client, guarda </w:t>
+      </w:r>
+      <w:r>
+        <w:rPr>
+          <w:b/>
+          <w:i w:val="0"/>
+        </w:rPr>
+        <w:t>quin client en substitueix un altre</w:t>
+      </w:r>
+      <w:r>
+        <w:rPr>
+          <w:b w:val="0"/>
+          <w:i w:val="0"/>
+        </w:rPr>
+        <w:t>, i per això només l'omplen els qui n'han substituït algun.</w:t>
+      </w:r>
+    </w:p>
+    <w:p>
+      <w:r>
+        <w:rPr>
+          <w:b w:val="0"/>
+          <w:i w:val="0"/>
+        </w:rPr>
+        <w:t xml:space="preserve">Mesurat sobre el cens sencer: 160 clients de 4.691 el porten informat, els 160 resolen contra un client existent, i la direcció és clara — 108 van de client viu a client de baixa i només 2 al revés. O sigui que apunta al </w:t>
+      </w:r>
+      <w:r>
+        <w:rPr>
+          <w:b/>
+          <w:i w:val="0"/>
+        </w:rPr>
+        <w:t>predecessor</w:t>
+      </w:r>
+      <w:r>
+        <w:rPr>
+          <w:b w:val="0"/>
+          <w:i w:val="0"/>
+        </w:rPr>
+        <w:t>. El procés que alimenta Analitza inverteix la relació pel seu compte; no cal tocar cap dada de SAP.</w:t>
+      </w:r>
+    </w:p>
+    <w:p>
+      <w:r>
+        <w:rPr>
+          <w:b w:val="0"/>
+          <w:i w:val="0"/>
+        </w:rPr>
+        <w:t>La taula de dalt queda així:</w:t>
+      </w:r>
+    </w:p>
+    <w:tbl>
+      <w:tblPr>
+        <w:tblStyle w:val="LightGrid-Accent1"/>
+        <w:tblW w:type="auto" w:w="0"/>
+        <w:tblLook w:firstColumn="1" w:firstRow="1" w:lastColumn="0" w:lastRow="0" w:noHBand="0" w:noVBand="1" w:val="04A0"/>
+      </w:tblPr>
+      <w:tblGrid>
+        <w:gridCol w:w="2880"/>
+        <w:gridCol w:w="2880"/>
+        <w:gridCol w:w="2880"/>
+      </w:tblGrid>
+      <w:tr>
+        <w:tc>
+          <w:tcPr>
+            <w:tcW w:type="dxa" w:w="2880"/>
+          </w:tcPr>
+          <w:p>
+            <w:r>
+              <w:rPr>
+                <w:b/>
+                <w:i w:val="0"/>
+              </w:rPr>
+              <w:t>Taula</w:t>
+            </w:r>
+          </w:p>
+        </w:tc>
+        <w:tc>
+          <w:tcPr>
+            <w:tcW w:type="dxa" w:w="2880"/>
+          </w:tcPr>
+          <w:p>
+            <w:r>
+              <w:rPr>
+                <w:b/>
+                <w:i w:val="0"/>
+              </w:rPr>
+              <w:t>Nom del camp</w:t>
+            </w:r>
+          </w:p>
+        </w:tc>
+        <w:tc>
+          <w:tcPr>
+            <w:tcW w:type="dxa" w:w="2880"/>
+          </w:tcPr>
+          <w:p>
+            <w:r>
+              <w:rPr>
+                <w:b/>
+                <w:i w:val="0"/>
+              </w:rPr>
+              <w:t>Estat</w:t>
+            </w:r>
+          </w:p>
+        </w:tc>
+      </w:tr>
+      <w:tr>
+        <w:tc>
+          <w:tcPr>
+            <w:tcW w:type="dxa" w:w="2880"/>
+          </w:tcPr>
+          <w:p>
+            <w:r>
+              <w:rPr>
+                <w:rFonts w:ascii="Consolas" w:hAnsi="Consolas"/>
+                <w:b w:val="0"/>
+                <w:i w:val="0"/>
+                <w:color w:val="333333"/>
+                <w:sz w:val="20"/>
+              </w:rPr>
+              <w:t>OSLP</w:t>
+            </w:r>
+            <w:r>
+              <w:rPr>
+                <w:b w:val="0"/>
+                <w:i w:val="0"/>
+              </w:rPr>
+              <w:t xml:space="preserve"> — Empleats de vendes</w:t>
+            </w:r>
+          </w:p>
+        </w:tc>
+        <w:tc>
+          <w:tcPr>
+            <w:tcW w:type="dxa" w:w="2880"/>
+          </w:tcPr>
+          <w:p>
+            <w:r>
+              <w:rPr>
+                <w:rFonts w:ascii="Consolas" w:hAnsi="Consolas"/>
+                <w:b w:val="0"/>
+                <w:i w:val="0"/>
+                <w:color w:val="333333"/>
+                <w:sz w:val="20"/>
+              </w:rPr>
+              <w:t>U_FCCodiKais</w:t>
+            </w:r>
+          </w:p>
+        </w:tc>
+        <w:tc>
+          <w:tcPr>
+            <w:tcW w:type="dxa" w:w="2880"/>
+          </w:tcPr>
+          <w:p>
+            <w:r>
+              <w:rPr>
+                <w:b w:val="0"/>
+                <w:i w:val="0"/>
+              </w:rPr>
+              <w:t>Ja existia. No el toco</w:t>
+            </w:r>
+          </w:p>
+        </w:tc>
+      </w:tr>
+      <w:tr>
+        <w:tc>
+          <w:tcPr>
+            <w:tcW w:type="dxa" w:w="2880"/>
+          </w:tcPr>
+          <w:p>
+            <w:r>
+              <w:rPr>
+                <w:rFonts w:ascii="Consolas" w:hAnsi="Consolas"/>
+                <w:b w:val="0"/>
+                <w:i w:val="0"/>
+                <w:color w:val="333333"/>
+                <w:sz w:val="20"/>
+              </w:rPr>
+              <w:t>OCRD</w:t>
+            </w:r>
+            <w:r>
+              <w:rPr>
+                <w:b w:val="0"/>
+                <w:i w:val="0"/>
+              </w:rPr>
+              <w:t xml:space="preserve"> — Interlocutors comercials</w:t>
+            </w:r>
+          </w:p>
+        </w:tc>
+        <w:tc>
+          <w:tcPr>
+            <w:tcW w:type="dxa" w:w="2880"/>
+          </w:tcPr>
+          <w:p>
+            <w:r>
+              <w:rPr>
+                <w:rFonts w:ascii="Consolas" w:hAnsi="Consolas"/>
+                <w:b w:val="0"/>
+                <w:i w:val="0"/>
+                <w:color w:val="333333"/>
+                <w:sz w:val="20"/>
+              </w:rPr>
+              <w:t>U_FCCodiKais</w:t>
+            </w:r>
+          </w:p>
+        </w:tc>
+        <w:tc>
+          <w:tcPr>
+            <w:tcW w:type="dxa" w:w="2880"/>
+          </w:tcPr>
+          <w:p>
+            <w:r>
+              <w:rPr>
+                <w:b w:val="0"/>
+                <w:i w:val="0"/>
+              </w:rPr>
+              <w:t>Creat el 26/08/2026</w:t>
+            </w:r>
+          </w:p>
+        </w:tc>
+      </w:tr>
+      <w:tr>
+        <w:tc>
+          <w:tcPr>
+            <w:tcW w:type="dxa" w:w="2880"/>
+          </w:tcPr>
+          <w:p>
+            <w:r>
+              <w:rPr>
+                <w:rFonts w:ascii="Consolas" w:hAnsi="Consolas"/>
+                <w:b w:val="0"/>
+                <w:i w:val="0"/>
+                <w:color w:val="333333"/>
+                <w:sz w:val="20"/>
+              </w:rPr>
+              <w:t>OCRD</w:t>
+            </w:r>
+            <w:r>
+              <w:rPr>
+                <w:b w:val="0"/>
+                <w:i w:val="0"/>
+              </w:rPr>
+              <w:t xml:space="preserve"> — Interlocutors comercials</w:t>
+            </w:r>
+          </w:p>
+        </w:tc>
+        <w:tc>
+          <w:tcPr>
+            <w:tcW w:type="dxa" w:w="2880"/>
+          </w:tcPr>
+          <w:p>
+            <w:r>
+              <w:rPr>
+                <w:rFonts w:ascii="Consolas" w:hAnsi="Consolas"/>
+                <w:b w:val="0"/>
+                <w:i w:val="0"/>
+                <w:color w:val="333333"/>
+                <w:sz w:val="20"/>
+              </w:rPr>
+              <w:t>U_SEICodienllac</w:t>
+            </w:r>
+          </w:p>
+        </w:tc>
+        <w:tc>
+          <w:tcPr>
+            <w:tcW w:type="dxa" w:w="2880"/>
+          </w:tcPr>
+          <w:p>
+            <w:r>
+              <w:rPr>
+                <w:b/>
+                <w:i w:val="0"/>
+              </w:rPr>
+              <w:t>Ja existia.</w:t>
+            </w:r>
+            <w:r>
+              <w:rPr>
+                <w:b w:val="0"/>
+                <w:i w:val="0"/>
+              </w:rPr>
+              <w:t xml:space="preserve"> No el toco, només el llegeixo</w:t>
+            </w:r>
+          </w:p>
+        </w:tc>
+      </w:tr>
+      <w:tr>
+        <w:tc>
+          <w:tcPr>
+            <w:tcW w:type="dxa" w:w="2880"/>
+          </w:tcPr>
+          <w:p>
+            <w:r>
+              <w:rPr>
+                <w:rFonts w:ascii="Consolas" w:hAnsi="Consolas"/>
+                <w:b w:val="0"/>
+                <w:i w:val="0"/>
+                <w:color w:val="333333"/>
+                <w:sz w:val="20"/>
+              </w:rPr>
+              <w:t>OITB</w:t>
+            </w:r>
+            <w:r>
+              <w:rPr>
+                <w:b w:val="0"/>
+                <w:i w:val="0"/>
+              </w:rPr>
+              <w:t xml:space="preserve"> — Grups d'articles</w:t>
+            </w:r>
+          </w:p>
+        </w:tc>
+        <w:tc>
+          <w:tcPr>
+            <w:tcW w:type="dxa" w:w="2880"/>
+          </w:tcPr>
+          <w:p>
+            <w:r>
+              <w:rPr>
+                <w:rFonts w:ascii="Consolas" w:hAnsi="Consolas"/>
+                <w:b w:val="0"/>
+                <w:i w:val="0"/>
+                <w:color w:val="333333"/>
+                <w:sz w:val="20"/>
+              </w:rPr>
+              <w:t>U_FCCodiKais</w:t>
+            </w:r>
+          </w:p>
+        </w:tc>
+        <w:tc>
+          <w:tcPr>
+            <w:tcW w:type="dxa" w:w="2880"/>
+          </w:tcPr>
+          <w:p>
+            <w:r>
+              <w:rPr>
+                <w:b w:val="0"/>
+                <w:i w:val="0"/>
+              </w:rPr>
+              <w:t>Creat el 26/08/2026</w:t>
+            </w:r>
+          </w:p>
+        </w:tc>
+      </w:tr>
+    </w:tbl>
+    <w:p/>
+    <w:p>
+      <w:r>
+        <w:rPr>
+          <w:rFonts w:ascii="Consolas" w:hAnsi="Consolas"/>
+          <w:b w:val="0"/>
+          <w:i w:val="0"/>
+          <w:color w:val="333333"/>
+          <w:sz w:val="20"/>
+        </w:rPr>
+        <w:t>OCRD.U_FCNewCardCode</w:t>
+      </w:r>
+      <w:r>
+        <w:rPr>
+          <w:b w:val="0"/>
+          <w:i w:val="0"/>
+        </w:rPr>
+        <w:t xml:space="preserve"> es va crear el 26/08/2026 i mai s'ha omplert (0 clients), de manera que esborrar-lo no perd cap dada. El procés de lectura ja no el demana. Un cop esborrat cal </w:t>
+      </w:r>
+      <w:r>
+        <w:rPr>
+          <w:b/>
+          <w:i w:val="0"/>
+        </w:rPr>
+        <w:t>reiniciar el Service Layer</w:t>
+      </w:r>
+      <w:r>
+        <w:rPr>
+          <w:b w:val="0"/>
+          <w:i w:val="0"/>
+        </w:rPr>
+        <w:t>, que es cacheja les metadades de la companyia: mentre no es reiniciï, el camp segueix als seus metadades tot i no existir a la base de dades.</w:t>
       </w:r>
     </w:p>
     <w:sectPr>

</xml_diff>